<commit_message>
added cars app and fetched the datat in the home page
</commit_message>
<xml_diff>
--- a/ReadMe.docx
+++ b/ReadMe.docx
@@ -1505,14 +1505,7 @@
           <w:bCs/>
         </w:rPr>
         <w:lastRenderedPageBreak/>
-        <w:t xml:space="preserve">Break home page to 3 parts </w:t>
-      </w:r>
-      <w:r>
-        <w:rPr>
-          <w:b/>
-          <w:bCs/>
-        </w:rPr>
-        <w:t xml:space="preserve"> (header, nav bar, footer) ..etc.</w:t>
+        <w:t>Break home page to 3 parts  (header, nav bar, footer) ..etc.</w:t>
       </w:r>
       <w:r>
         <w:rPr>
@@ -1799,18 +1792,15 @@
     <w:p>
       <w:pPr>
         <w:rPr>
-          <w:b/>
-          <w:bCs/>
-        </w:rPr>
-      </w:pPr>
-      <w:r>
-        <w:rPr>
           <w:noProof/>
         </w:rPr>
+      </w:pPr>
+      <w:r>
+        <w:rPr>
+          <w:noProof/>
+        </w:rPr>
         <w:t>l</w:t>
       </w:r>
-      <w:bookmarkStart w:id="0" w:name="_GoBack"/>
-      <w:bookmarkEnd w:id="0"/>
       <w:r>
         <w:rPr>
           <w:noProof/>
@@ -1851,6 +1841,2740 @@
           </wp:inline>
         </w:drawing>
       </w:r>
+    </w:p>
+    <w:p>
+      <w:pPr>
+        <w:pStyle w:val="ListParagraph"/>
+        <w:numPr>
+          <w:ilvl w:val="0"/>
+          <w:numId w:val="1"/>
+        </w:numPr>
+        <w:rPr>
+          <w:b/>
+          <w:bCs/>
+        </w:rPr>
+      </w:pPr>
+      <w:r>
+        <w:rPr>
+          <w:b/>
+          <w:bCs/>
+        </w:rPr>
+        <w:t xml:space="preserve">Create DB “carzone_db” in postsql and change the assign the db in stting.py </w:t>
+      </w:r>
+    </w:p>
+    <w:p>
+      <w:pPr>
+        <w:pStyle w:val="ListParagraph"/>
+        <w:rPr>
+          <w:b/>
+          <w:bCs/>
+        </w:rPr>
+      </w:pPr>
+      <w:r>
+        <w:rPr>
+          <w:noProof/>
+        </w:rPr>
+        <w:drawing>
+          <wp:inline distT="0" distB="0" distL="0" distR="0" wp14:anchorId="1F2FAB55" wp14:editId="01C32CC3">
+            <wp:extent cx="1852613" cy="733635"/>
+            <wp:effectExtent l="0" t="0" r="0" b="9525"/>
+            <wp:docPr id="22" name="Picture 22"/>
+            <wp:cNvGraphicFramePr>
+              <a:graphicFrameLocks xmlns:a="http://schemas.openxmlformats.org/drawingml/2006/main" noChangeAspect="1"/>
+            </wp:cNvGraphicFramePr>
+            <a:graphic xmlns:a="http://schemas.openxmlformats.org/drawingml/2006/main">
+              <a:graphicData uri="http://schemas.openxmlformats.org/drawingml/2006/picture">
+                <pic:pic xmlns:pic="http://schemas.openxmlformats.org/drawingml/2006/picture">
+                  <pic:nvPicPr>
+                    <pic:cNvPr id="1" name=""/>
+                    <pic:cNvPicPr/>
+                  </pic:nvPicPr>
+                  <pic:blipFill>
+                    <a:blip r:embed="rId25"/>
+                    <a:stretch>
+                      <a:fillRect/>
+                    </a:stretch>
+                  </pic:blipFill>
+                  <pic:spPr>
+                    <a:xfrm>
+                      <a:off x="0" y="0"/>
+                      <a:ext cx="1890743" cy="748734"/>
+                    </a:xfrm>
+                    <a:prstGeom prst="rect">
+                      <a:avLst/>
+                    </a:prstGeom>
+                  </pic:spPr>
+                </pic:pic>
+              </a:graphicData>
+            </a:graphic>
+          </wp:inline>
+        </w:drawing>
+      </w:r>
+    </w:p>
+    <w:p>
+      <w:pPr>
+        <w:pStyle w:val="ListParagraph"/>
+        <w:numPr>
+          <w:ilvl w:val="0"/>
+          <w:numId w:val="1"/>
+        </w:numPr>
+        <w:rPr>
+          <w:b/>
+          <w:bCs/>
+        </w:rPr>
+      </w:pPr>
+      <w:r>
+        <w:rPr>
+          <w:b/>
+          <w:bCs/>
+        </w:rPr>
+        <w:t>Python mange.py makemigrations</w:t>
+      </w:r>
+    </w:p>
+    <w:p>
+      <w:pPr>
+        <w:pStyle w:val="ListParagraph"/>
+        <w:numPr>
+          <w:ilvl w:val="0"/>
+          <w:numId w:val="1"/>
+        </w:numPr>
+        <w:rPr>
+          <w:b/>
+          <w:bCs/>
+        </w:rPr>
+      </w:pPr>
+      <w:r>
+        <w:rPr>
+          <w:b/>
+          <w:bCs/>
+        </w:rPr>
+        <w:t>Python mange.py migrate</w:t>
+      </w:r>
+    </w:p>
+    <w:p>
+      <w:pPr>
+        <w:pStyle w:val="ListParagraph"/>
+        <w:numPr>
+          <w:ilvl w:val="0"/>
+          <w:numId w:val="1"/>
+        </w:numPr>
+        <w:rPr>
+          <w:b/>
+          <w:bCs/>
+        </w:rPr>
+      </w:pPr>
+      <w:r>
+        <w:rPr>
+          <w:b/>
+          <w:bCs/>
+        </w:rPr>
+        <w:t xml:space="preserve">Create superuser </w:t>
+      </w:r>
+    </w:p>
+    <w:p>
+      <w:pPr>
+        <w:pStyle w:val="ListParagraph"/>
+        <w:rPr>
+          <w:b/>
+          <w:bCs/>
+        </w:rPr>
+      </w:pPr>
+      <w:r>
+        <w:rPr>
+          <w:noProof/>
+        </w:rPr>
+        <w:drawing>
+          <wp:inline distT="0" distB="0" distL="0" distR="0" wp14:anchorId="265A4C31" wp14:editId="3591CB91">
+            <wp:extent cx="1933575" cy="696503"/>
+            <wp:effectExtent l="0" t="0" r="0" b="8890"/>
+            <wp:docPr id="11" name="Picture 11"/>
+            <wp:cNvGraphicFramePr>
+              <a:graphicFrameLocks xmlns:a="http://schemas.openxmlformats.org/drawingml/2006/main" noChangeAspect="1"/>
+            </wp:cNvGraphicFramePr>
+            <a:graphic xmlns:a="http://schemas.openxmlformats.org/drawingml/2006/main">
+              <a:graphicData uri="http://schemas.openxmlformats.org/drawingml/2006/picture">
+                <pic:pic xmlns:pic="http://schemas.openxmlformats.org/drawingml/2006/picture">
+                  <pic:nvPicPr>
+                    <pic:cNvPr id="1" name=""/>
+                    <pic:cNvPicPr/>
+                  </pic:nvPicPr>
+                  <pic:blipFill>
+                    <a:blip r:embed="rId26"/>
+                    <a:stretch>
+                      <a:fillRect/>
+                    </a:stretch>
+                  </pic:blipFill>
+                  <pic:spPr>
+                    <a:xfrm>
+                      <a:off x="0" y="0"/>
+                      <a:ext cx="1971932" cy="710320"/>
+                    </a:xfrm>
+                    <a:prstGeom prst="rect">
+                      <a:avLst/>
+                    </a:prstGeom>
+                  </pic:spPr>
+                </pic:pic>
+              </a:graphicData>
+            </a:graphic>
+          </wp:inline>
+        </w:drawing>
+      </w:r>
+    </w:p>
+    <w:p>
+      <w:pPr>
+        <w:pStyle w:val="ListParagraph"/>
+        <w:numPr>
+          <w:ilvl w:val="0"/>
+          <w:numId w:val="1"/>
+        </w:numPr>
+        <w:rPr>
+          <w:b/>
+          <w:bCs/>
+        </w:rPr>
+      </w:pPr>
+      <w:r>
+        <w:rPr>
+          <w:b/>
+          <w:bCs/>
+        </w:rPr>
+        <w:t xml:space="preserve">Create team model to display the team info </w:t>
+      </w:r>
+      <w:r>
+        <w:rPr>
+          <w:b/>
+          <w:bCs/>
+        </w:rPr>
+        <w:t>called (team)</w:t>
+      </w:r>
+    </w:p>
+    <w:p>
+      <w:pPr>
+        <w:pStyle w:val="ListParagraph"/>
+        <w:rPr>
+          <w:b/>
+          <w:bCs/>
+        </w:rPr>
+      </w:pPr>
+      <w:r>
+        <w:rPr>
+          <w:noProof/>
+        </w:rPr>
+        <w:drawing>
+          <wp:inline distT="0" distB="0" distL="0" distR="0" wp14:anchorId="7A9B9787" wp14:editId="41934E61">
+            <wp:extent cx="3405188" cy="1108263"/>
+            <wp:effectExtent l="0" t="0" r="5080" b="0"/>
+            <wp:docPr id="20" name="Picture 20"/>
+            <wp:cNvGraphicFramePr>
+              <a:graphicFrameLocks xmlns:a="http://schemas.openxmlformats.org/drawingml/2006/main" noChangeAspect="1"/>
+            </wp:cNvGraphicFramePr>
+            <a:graphic xmlns:a="http://schemas.openxmlformats.org/drawingml/2006/main">
+              <a:graphicData uri="http://schemas.openxmlformats.org/drawingml/2006/picture">
+                <pic:pic xmlns:pic="http://schemas.openxmlformats.org/drawingml/2006/picture">
+                  <pic:nvPicPr>
+                    <pic:cNvPr id="1" name=""/>
+                    <pic:cNvPicPr/>
+                  </pic:nvPicPr>
+                  <pic:blipFill>
+                    <a:blip r:embed="rId27"/>
+                    <a:stretch>
+                      <a:fillRect/>
+                    </a:stretch>
+                  </pic:blipFill>
+                  <pic:spPr>
+                    <a:xfrm>
+                      <a:off x="0" y="0"/>
+                      <a:ext cx="3420329" cy="1113191"/>
+                    </a:xfrm>
+                    <a:prstGeom prst="rect">
+                      <a:avLst/>
+                    </a:prstGeom>
+                  </pic:spPr>
+                </pic:pic>
+              </a:graphicData>
+            </a:graphic>
+          </wp:inline>
+        </w:drawing>
+      </w:r>
+    </w:p>
+    <w:p>
+      <w:pPr>
+        <w:pStyle w:val="ListParagraph"/>
+        <w:rPr>
+          <w:b/>
+          <w:bCs/>
+        </w:rPr>
+      </w:pPr>
+    </w:p>
+    <w:p>
+      <w:pPr>
+        <w:pStyle w:val="ListParagraph"/>
+        <w:numPr>
+          <w:ilvl w:val="0"/>
+          <w:numId w:val="1"/>
+        </w:numPr>
+        <w:rPr>
+          <w:b/>
+          <w:bCs/>
+        </w:rPr>
+      </w:pPr>
+      <w:r>
+        <w:rPr>
+          <w:b/>
+          <w:bCs/>
+        </w:rPr>
+        <w:lastRenderedPageBreak/>
+        <w:t>Register model in admin.py</w:t>
+      </w:r>
+    </w:p>
+    <w:p>
+      <w:pPr>
+        <w:pStyle w:val="ListParagraph"/>
+        <w:rPr>
+          <w:b/>
+          <w:bCs/>
+        </w:rPr>
+      </w:pPr>
+      <w:r>
+        <w:rPr>
+          <w:noProof/>
+        </w:rPr>
+        <w:drawing>
+          <wp:inline distT="0" distB="0" distL="0" distR="0" wp14:anchorId="20CDD418" wp14:editId="2856E274">
+            <wp:extent cx="1862138" cy="1042710"/>
+            <wp:effectExtent l="0" t="0" r="5080" b="5080"/>
+            <wp:docPr id="24" name="Picture 24"/>
+            <wp:cNvGraphicFramePr>
+              <a:graphicFrameLocks xmlns:a="http://schemas.openxmlformats.org/drawingml/2006/main" noChangeAspect="1"/>
+            </wp:cNvGraphicFramePr>
+            <a:graphic xmlns:a="http://schemas.openxmlformats.org/drawingml/2006/main">
+              <a:graphicData uri="http://schemas.openxmlformats.org/drawingml/2006/picture">
+                <pic:pic xmlns:pic="http://schemas.openxmlformats.org/drawingml/2006/picture">
+                  <pic:nvPicPr>
+                    <pic:cNvPr id="1" name=""/>
+                    <pic:cNvPicPr/>
+                  </pic:nvPicPr>
+                  <pic:blipFill>
+                    <a:blip r:embed="rId28"/>
+                    <a:stretch>
+                      <a:fillRect/>
+                    </a:stretch>
+                  </pic:blipFill>
+                  <pic:spPr>
+                    <a:xfrm>
+                      <a:off x="0" y="0"/>
+                      <a:ext cx="1876988" cy="1051025"/>
+                    </a:xfrm>
+                    <a:prstGeom prst="rect">
+                      <a:avLst/>
+                    </a:prstGeom>
+                  </pic:spPr>
+                </pic:pic>
+              </a:graphicData>
+            </a:graphic>
+          </wp:inline>
+        </w:drawing>
+      </w:r>
+    </w:p>
+    <w:p>
+      <w:pPr>
+        <w:pStyle w:val="ListParagraph"/>
+        <w:numPr>
+          <w:ilvl w:val="0"/>
+          <w:numId w:val="1"/>
+        </w:numPr>
+        <w:rPr>
+          <w:b/>
+          <w:bCs/>
+        </w:rPr>
+      </w:pPr>
+      <w:r>
+        <w:rPr>
+          <w:b/>
+          <w:bCs/>
+        </w:rPr>
+        <w:t xml:space="preserve">Register the media to make the image links work in the admin </w:t>
+      </w:r>
+    </w:p>
+    <w:p>
+      <w:pPr>
+        <w:pStyle w:val="ListParagraph"/>
+        <w:rPr>
+          <w:b/>
+          <w:bCs/>
+        </w:rPr>
+      </w:pPr>
+      <w:r>
+        <w:rPr>
+          <w:noProof/>
+        </w:rPr>
+        <w:drawing>
+          <wp:inline distT="0" distB="0" distL="0" distR="0" wp14:anchorId="6F5E32AC" wp14:editId="31DC0986">
+            <wp:extent cx="3629025" cy="285618"/>
+            <wp:effectExtent l="0" t="0" r="0" b="635"/>
+            <wp:docPr id="23" name="Picture 23"/>
+            <wp:cNvGraphicFramePr>
+              <a:graphicFrameLocks xmlns:a="http://schemas.openxmlformats.org/drawingml/2006/main" noChangeAspect="1"/>
+            </wp:cNvGraphicFramePr>
+            <a:graphic xmlns:a="http://schemas.openxmlformats.org/drawingml/2006/main">
+              <a:graphicData uri="http://schemas.openxmlformats.org/drawingml/2006/picture">
+                <pic:pic xmlns:pic="http://schemas.openxmlformats.org/drawingml/2006/picture">
+                  <pic:nvPicPr>
+                    <pic:cNvPr id="1" name=""/>
+                    <pic:cNvPicPr/>
+                  </pic:nvPicPr>
+                  <pic:blipFill>
+                    <a:blip r:embed="rId29"/>
+                    <a:stretch>
+                      <a:fillRect/>
+                    </a:stretch>
+                  </pic:blipFill>
+                  <pic:spPr>
+                    <a:xfrm>
+                      <a:off x="0" y="0"/>
+                      <a:ext cx="3764085" cy="296248"/>
+                    </a:xfrm>
+                    <a:prstGeom prst="rect">
+                      <a:avLst/>
+                    </a:prstGeom>
+                  </pic:spPr>
+                </pic:pic>
+              </a:graphicData>
+            </a:graphic>
+          </wp:inline>
+        </w:drawing>
+      </w:r>
+    </w:p>
+    <w:p>
+      <w:pPr>
+        <w:pStyle w:val="ListParagraph"/>
+        <w:numPr>
+          <w:ilvl w:val="0"/>
+          <w:numId w:val="1"/>
+        </w:numPr>
+        <w:rPr>
+          <w:b/>
+          <w:bCs/>
+        </w:rPr>
+      </w:pPr>
+      <w:r>
+        <w:rPr>
+          <w:b/>
+          <w:bCs/>
+        </w:rPr>
+        <w:t>Urls.py in project use static to include MEDIA_URL</w:t>
+      </w:r>
+    </w:p>
+    <w:p>
+      <w:pPr>
+        <w:pStyle w:val="ListParagraph"/>
+        <w:rPr>
+          <w:b/>
+          <w:bCs/>
+        </w:rPr>
+      </w:pPr>
+      <w:r>
+        <w:rPr>
+          <w:noProof/>
+        </w:rPr>
+        <w:drawing>
+          <wp:inline distT="0" distB="0" distL="0" distR="0" wp14:anchorId="7A2E4C75" wp14:editId="78660780">
+            <wp:extent cx="3128963" cy="1076305"/>
+            <wp:effectExtent l="0" t="0" r="0" b="0"/>
+            <wp:docPr id="25" name="Picture 25"/>
+            <wp:cNvGraphicFramePr>
+              <a:graphicFrameLocks xmlns:a="http://schemas.openxmlformats.org/drawingml/2006/main" noChangeAspect="1"/>
+            </wp:cNvGraphicFramePr>
+            <a:graphic xmlns:a="http://schemas.openxmlformats.org/drawingml/2006/main">
+              <a:graphicData uri="http://schemas.openxmlformats.org/drawingml/2006/picture">
+                <pic:pic xmlns:pic="http://schemas.openxmlformats.org/drawingml/2006/picture">
+                  <pic:nvPicPr>
+                    <pic:cNvPr id="1" name=""/>
+                    <pic:cNvPicPr/>
+                  </pic:nvPicPr>
+                  <pic:blipFill>
+                    <a:blip r:embed="rId30"/>
+                    <a:stretch>
+                      <a:fillRect/>
+                    </a:stretch>
+                  </pic:blipFill>
+                  <pic:spPr>
+                    <a:xfrm>
+                      <a:off x="0" y="0"/>
+                      <a:ext cx="3170946" cy="1090746"/>
+                    </a:xfrm>
+                    <a:prstGeom prst="rect">
+                      <a:avLst/>
+                    </a:prstGeom>
+                  </pic:spPr>
+                </pic:pic>
+              </a:graphicData>
+            </a:graphic>
+          </wp:inline>
+        </w:drawing>
+      </w:r>
+    </w:p>
+    <w:p>
+      <w:pPr>
+        <w:pStyle w:val="ListParagraph"/>
+        <w:numPr>
+          <w:ilvl w:val="0"/>
+          <w:numId w:val="1"/>
+        </w:numPr>
+        <w:rPr>
+          <w:b/>
+          <w:bCs/>
+        </w:rPr>
+      </w:pPr>
+      <w:r>
+        <w:rPr>
+          <w:b/>
+          <w:bCs/>
+        </w:rPr>
+        <w:t>Inside</w:t>
+      </w:r>
+      <w:r>
+        <w:rPr>
+          <w:b/>
+          <w:bCs/>
+        </w:rPr>
+        <w:t xml:space="preserve"> the page-&gt; view.py and add the team</w:t>
+      </w:r>
+      <w:r>
+        <w:rPr>
+          <w:b/>
+          <w:bCs/>
+        </w:rPr>
+        <w:t xml:space="preserve"> to get DB info to home page.</w:t>
+      </w:r>
+    </w:p>
+    <w:p>
+      <w:pPr>
+        <w:pStyle w:val="ListParagraph"/>
+        <w:rPr>
+          <w:b/>
+          <w:bCs/>
+        </w:rPr>
+      </w:pPr>
+    </w:p>
+    <w:p>
+      <w:pPr>
+        <w:pStyle w:val="ListParagraph"/>
+        <w:rPr>
+          <w:b/>
+          <w:bCs/>
+        </w:rPr>
+      </w:pPr>
+      <w:r>
+        <w:rPr>
+          <w:noProof/>
+        </w:rPr>
+        <w:drawing>
+          <wp:inline distT="0" distB="0" distL="0" distR="0" wp14:anchorId="54456A03" wp14:editId="4E21E5DF">
+            <wp:extent cx="2867025" cy="831901"/>
+            <wp:effectExtent l="0" t="0" r="0" b="6350"/>
+            <wp:docPr id="26" name="Picture 26"/>
+            <wp:cNvGraphicFramePr>
+              <a:graphicFrameLocks xmlns:a="http://schemas.openxmlformats.org/drawingml/2006/main" noChangeAspect="1"/>
+            </wp:cNvGraphicFramePr>
+            <a:graphic xmlns:a="http://schemas.openxmlformats.org/drawingml/2006/main">
+              <a:graphicData uri="http://schemas.openxmlformats.org/drawingml/2006/picture">
+                <pic:pic xmlns:pic="http://schemas.openxmlformats.org/drawingml/2006/picture">
+                  <pic:nvPicPr>
+                    <pic:cNvPr id="1" name=""/>
+                    <pic:cNvPicPr/>
+                  </pic:nvPicPr>
+                  <pic:blipFill>
+                    <a:blip r:embed="rId31"/>
+                    <a:stretch>
+                      <a:fillRect/>
+                    </a:stretch>
+                  </pic:blipFill>
+                  <pic:spPr>
+                    <a:xfrm>
+                      <a:off x="0" y="0"/>
+                      <a:ext cx="2893384" cy="839549"/>
+                    </a:xfrm>
+                    <a:prstGeom prst="rect">
+                      <a:avLst/>
+                    </a:prstGeom>
+                  </pic:spPr>
+                </pic:pic>
+              </a:graphicData>
+            </a:graphic>
+          </wp:inline>
+        </w:drawing>
+      </w:r>
+    </w:p>
+    <w:p>
+      <w:pPr>
+        <w:pStyle w:val="ListParagraph"/>
+        <w:numPr>
+          <w:ilvl w:val="0"/>
+          <w:numId w:val="1"/>
+        </w:numPr>
+        <w:rPr>
+          <w:b/>
+          <w:bCs/>
+        </w:rPr>
+      </w:pPr>
+      <w:r>
+        <w:rPr>
+          <w:b/>
+          <w:bCs/>
+        </w:rPr>
+        <w:t>We add for loop in home.html and about.html pages to loop throw team table.</w:t>
+      </w:r>
+    </w:p>
+    <w:p>
+      <w:pPr>
+        <w:pStyle w:val="ListParagraph"/>
+        <w:rPr>
+          <w:b/>
+          <w:bCs/>
+        </w:rPr>
+      </w:pPr>
+      <w:r>
+        <w:rPr>
+          <w:b/>
+          <w:bCs/>
+        </w:rPr>
+        <w:t>And we link the team information such {{team.first_name}}</w:t>
+      </w:r>
+    </w:p>
+    <w:p>
+      <w:pPr>
+        <w:pStyle w:val="ListParagraph"/>
+        <w:rPr>
+          <w:b/>
+          <w:bCs/>
+        </w:rPr>
+      </w:pPr>
+      <w:r>
+        <w:rPr>
+          <w:noProof/>
+        </w:rPr>
+        <w:drawing>
+          <wp:inline distT="0" distB="0" distL="0" distR="0" wp14:anchorId="062C18E0" wp14:editId="572995BD">
+            <wp:extent cx="2786063" cy="1107653"/>
+            <wp:effectExtent l="0" t="0" r="0" b="0"/>
+            <wp:docPr id="27" name="Picture 27"/>
+            <wp:cNvGraphicFramePr>
+              <a:graphicFrameLocks xmlns:a="http://schemas.openxmlformats.org/drawingml/2006/main" noChangeAspect="1"/>
+            </wp:cNvGraphicFramePr>
+            <a:graphic xmlns:a="http://schemas.openxmlformats.org/drawingml/2006/main">
+              <a:graphicData uri="http://schemas.openxmlformats.org/drawingml/2006/picture">
+                <pic:pic xmlns:pic="http://schemas.openxmlformats.org/drawingml/2006/picture">
+                  <pic:nvPicPr>
+                    <pic:cNvPr id="1" name=""/>
+                    <pic:cNvPicPr/>
+                  </pic:nvPicPr>
+                  <pic:blipFill>
+                    <a:blip r:embed="rId32"/>
+                    <a:stretch>
+                      <a:fillRect/>
+                    </a:stretch>
+                  </pic:blipFill>
+                  <pic:spPr>
+                    <a:xfrm>
+                      <a:off x="0" y="0"/>
+                      <a:ext cx="2835694" cy="1127385"/>
+                    </a:xfrm>
+                    <a:prstGeom prst="rect">
+                      <a:avLst/>
+                    </a:prstGeom>
+                  </pic:spPr>
+                </pic:pic>
+              </a:graphicData>
+            </a:graphic>
+          </wp:inline>
+        </w:drawing>
+      </w:r>
+    </w:p>
+    <w:p>
+      <w:pPr>
+        <w:pStyle w:val="ListParagraph"/>
+        <w:numPr>
+          <w:ilvl w:val="0"/>
+          <w:numId w:val="1"/>
+        </w:numPr>
+        <w:rPr>
+          <w:b/>
+          <w:bCs/>
+        </w:rPr>
+      </w:pPr>
+      <w:r>
+        <w:rPr>
+          <w:b/>
+          <w:bCs/>
+        </w:rPr>
+        <w:t xml:space="preserve">To </w:t>
+      </w:r>
+      <w:r>
+        <w:rPr>
+          <w:b/>
+          <w:bCs/>
+        </w:rPr>
+        <w:t>display</w:t>
+      </w:r>
+      <w:r>
+        <w:rPr>
+          <w:b/>
+          <w:bCs/>
+        </w:rPr>
+        <w:t xml:space="preserve"> </w:t>
+      </w:r>
+      <w:r>
+        <w:rPr>
+          <w:b/>
+          <w:bCs/>
+        </w:rPr>
+        <w:t>tables head in admin page we have to create class has all items we need to be show and register the class name in admin.site.register()</w:t>
+      </w:r>
+    </w:p>
+    <w:p>
+      <w:pPr>
+        <w:pStyle w:val="ListParagraph"/>
+        <w:rPr>
+          <w:b/>
+          <w:bCs/>
+        </w:rPr>
+      </w:pPr>
+      <w:r>
+        <w:rPr>
+          <w:noProof/>
+        </w:rPr>
+        <w:drawing>
+          <wp:inline distT="0" distB="0" distL="0" distR="0" wp14:anchorId="34B65702" wp14:editId="1CF68E96">
+            <wp:extent cx="3919538" cy="363827"/>
+            <wp:effectExtent l="0" t="0" r="0" b="0"/>
+            <wp:docPr id="29" name="Picture 29"/>
+            <wp:cNvGraphicFramePr>
+              <a:graphicFrameLocks xmlns:a="http://schemas.openxmlformats.org/drawingml/2006/main" noChangeAspect="1"/>
+            </wp:cNvGraphicFramePr>
+            <a:graphic xmlns:a="http://schemas.openxmlformats.org/drawingml/2006/main">
+              <a:graphicData uri="http://schemas.openxmlformats.org/drawingml/2006/picture">
+                <pic:pic xmlns:pic="http://schemas.openxmlformats.org/drawingml/2006/picture">
+                  <pic:nvPicPr>
+                    <pic:cNvPr id="1" name=""/>
+                    <pic:cNvPicPr/>
+                  </pic:nvPicPr>
+                  <pic:blipFill>
+                    <a:blip r:embed="rId33"/>
+                    <a:stretch>
+                      <a:fillRect/>
+                    </a:stretch>
+                  </pic:blipFill>
+                  <pic:spPr>
+                    <a:xfrm>
+                      <a:off x="0" y="0"/>
+                      <a:ext cx="4070807" cy="377868"/>
+                    </a:xfrm>
+                    <a:prstGeom prst="rect">
+                      <a:avLst/>
+                    </a:prstGeom>
+                  </pic:spPr>
+                </pic:pic>
+              </a:graphicData>
+            </a:graphic>
+          </wp:inline>
+        </w:drawing>
+      </w:r>
+    </w:p>
+    <w:p>
+      <w:pPr>
+        <w:pStyle w:val="ListParagraph"/>
+        <w:numPr>
+          <w:ilvl w:val="0"/>
+          <w:numId w:val="1"/>
+        </w:numPr>
+        <w:rPr>
+          <w:b/>
+          <w:bCs/>
+        </w:rPr>
+      </w:pPr>
+      <w:r>
+        <w:rPr>
+          <w:b/>
+          <w:bCs/>
+        </w:rPr>
+        <w:t xml:space="preserve">To make item clickable </w:t>
+      </w:r>
+    </w:p>
+    <w:p>
+      <w:pPr>
+        <w:pStyle w:val="ListParagraph"/>
+        <w:rPr>
+          <w:b/>
+          <w:bCs/>
+        </w:rPr>
+      </w:pPr>
+      <w:r>
+        <w:rPr>
+          <w:noProof/>
+        </w:rPr>
+        <w:drawing>
+          <wp:inline distT="0" distB="0" distL="0" distR="0" wp14:anchorId="7ADB460A" wp14:editId="6D670C83">
+            <wp:extent cx="3919220" cy="392376"/>
+            <wp:effectExtent l="0" t="0" r="0" b="8255"/>
+            <wp:docPr id="31" name="Picture 31"/>
+            <wp:cNvGraphicFramePr>
+              <a:graphicFrameLocks xmlns:a="http://schemas.openxmlformats.org/drawingml/2006/main" noChangeAspect="1"/>
+            </wp:cNvGraphicFramePr>
+            <a:graphic xmlns:a="http://schemas.openxmlformats.org/drawingml/2006/main">
+              <a:graphicData uri="http://schemas.openxmlformats.org/drawingml/2006/picture">
+                <pic:pic xmlns:pic="http://schemas.openxmlformats.org/drawingml/2006/picture">
+                  <pic:nvPicPr>
+                    <pic:cNvPr id="1" name=""/>
+                    <pic:cNvPicPr/>
+                  </pic:nvPicPr>
+                  <pic:blipFill>
+                    <a:blip r:embed="rId34"/>
+                    <a:stretch>
+                      <a:fillRect/>
+                    </a:stretch>
+                  </pic:blipFill>
+                  <pic:spPr>
+                    <a:xfrm>
+                      <a:off x="0" y="0"/>
+                      <a:ext cx="4081393" cy="408612"/>
+                    </a:xfrm>
+                    <a:prstGeom prst="rect">
+                      <a:avLst/>
+                    </a:prstGeom>
+                  </pic:spPr>
+                </pic:pic>
+              </a:graphicData>
+            </a:graphic>
+          </wp:inline>
+        </w:drawing>
+      </w:r>
+    </w:p>
+    <w:p>
+      <w:pPr>
+        <w:pStyle w:val="ListParagraph"/>
+        <w:numPr>
+          <w:ilvl w:val="0"/>
+          <w:numId w:val="1"/>
+        </w:numPr>
+        <w:rPr>
+          <w:b/>
+          <w:bCs/>
+        </w:rPr>
+      </w:pPr>
+      <w:r>
+        <w:rPr>
+          <w:b/>
+          <w:bCs/>
+        </w:rPr>
+        <w:t xml:space="preserve">To add the thumbnail to item in admin </w:t>
+      </w:r>
+    </w:p>
+    <w:p>
+      <w:pPr>
+        <w:pStyle w:val="ListParagraph"/>
+        <w:rPr>
+          <w:b/>
+          <w:bCs/>
+        </w:rPr>
+      </w:pPr>
+      <w:r>
+        <w:rPr>
+          <w:noProof/>
+        </w:rPr>
+        <w:drawing>
+          <wp:inline distT="0" distB="0" distL="0" distR="0" wp14:anchorId="732A3CFC" wp14:editId="4AE1D8EE">
+            <wp:extent cx="3921699" cy="938213"/>
+            <wp:effectExtent l="0" t="0" r="3175" b="0"/>
+            <wp:docPr id="32" name="Picture 32"/>
+            <wp:cNvGraphicFramePr>
+              <a:graphicFrameLocks xmlns:a="http://schemas.openxmlformats.org/drawingml/2006/main" noChangeAspect="1"/>
+            </wp:cNvGraphicFramePr>
+            <a:graphic xmlns:a="http://schemas.openxmlformats.org/drawingml/2006/main">
+              <a:graphicData uri="http://schemas.openxmlformats.org/drawingml/2006/picture">
+                <pic:pic xmlns:pic="http://schemas.openxmlformats.org/drawingml/2006/picture">
+                  <pic:nvPicPr>
+                    <pic:cNvPr id="1" name=""/>
+                    <pic:cNvPicPr/>
+                  </pic:nvPicPr>
+                  <pic:blipFill>
+                    <a:blip r:embed="rId35"/>
+                    <a:stretch>
+                      <a:fillRect/>
+                    </a:stretch>
+                  </pic:blipFill>
+                  <pic:spPr>
+                    <a:xfrm>
+                      <a:off x="0" y="0"/>
+                      <a:ext cx="3983161" cy="952917"/>
+                    </a:xfrm>
+                    <a:prstGeom prst="rect">
+                      <a:avLst/>
+                    </a:prstGeom>
+                  </pic:spPr>
+                </pic:pic>
+              </a:graphicData>
+            </a:graphic>
+          </wp:inline>
+        </w:drawing>
+      </w:r>
+      <w:r>
+        <w:rPr>
+          <w:b/>
+          <w:bCs/>
+        </w:rPr>
+        <w:t xml:space="preserve"> </w:t>
+      </w:r>
+    </w:p>
+    <w:p>
+      <w:pPr>
+        <w:pStyle w:val="ListParagraph"/>
+        <w:numPr>
+          <w:ilvl w:val="0"/>
+          <w:numId w:val="1"/>
+        </w:numPr>
+        <w:rPr>
+          <w:b/>
+          <w:bCs/>
+        </w:rPr>
+      </w:pPr>
+      <w:r>
+        <w:rPr>
+          <w:b/>
+          <w:bCs/>
+        </w:rPr>
+        <w:lastRenderedPageBreak/>
+        <w:t xml:space="preserve">We use search_fields to make a search for team in admin page the search by ( first_name, last_name, designation) </w:t>
+      </w:r>
+    </w:p>
+    <w:p>
+      <w:pPr>
+        <w:pStyle w:val="ListParagraph"/>
+        <w:rPr>
+          <w:b/>
+          <w:bCs/>
+        </w:rPr>
+      </w:pPr>
+      <w:r>
+        <w:rPr>
+          <w:noProof/>
+        </w:rPr>
+        <w:drawing>
+          <wp:inline distT="0" distB="0" distL="0" distR="0" wp14:anchorId="46F8B6E7" wp14:editId="23EDD65F">
+            <wp:extent cx="2643188" cy="147791"/>
+            <wp:effectExtent l="0" t="0" r="0" b="5080"/>
+            <wp:docPr id="34" name="Picture 34"/>
+            <wp:cNvGraphicFramePr>
+              <a:graphicFrameLocks xmlns:a="http://schemas.openxmlformats.org/drawingml/2006/main" noChangeAspect="1"/>
+            </wp:cNvGraphicFramePr>
+            <a:graphic xmlns:a="http://schemas.openxmlformats.org/drawingml/2006/main">
+              <a:graphicData uri="http://schemas.openxmlformats.org/drawingml/2006/picture">
+                <pic:pic xmlns:pic="http://schemas.openxmlformats.org/drawingml/2006/picture">
+                  <pic:nvPicPr>
+                    <pic:cNvPr id="1" name=""/>
+                    <pic:cNvPicPr/>
+                  </pic:nvPicPr>
+                  <pic:blipFill>
+                    <a:blip r:embed="rId36"/>
+                    <a:stretch>
+                      <a:fillRect/>
+                    </a:stretch>
+                  </pic:blipFill>
+                  <pic:spPr>
+                    <a:xfrm>
+                      <a:off x="0" y="0"/>
+                      <a:ext cx="2759236" cy="154280"/>
+                    </a:xfrm>
+                    <a:prstGeom prst="rect">
+                      <a:avLst/>
+                    </a:prstGeom>
+                  </pic:spPr>
+                </pic:pic>
+              </a:graphicData>
+            </a:graphic>
+          </wp:inline>
+        </w:drawing>
+      </w:r>
+    </w:p>
+    <w:p>
+      <w:pPr>
+        <w:pStyle w:val="ListParagraph"/>
+        <w:rPr>
+          <w:b/>
+          <w:bCs/>
+        </w:rPr>
+      </w:pPr>
+    </w:p>
+    <w:p>
+      <w:pPr>
+        <w:pStyle w:val="ListParagraph"/>
+        <w:numPr>
+          <w:ilvl w:val="0"/>
+          <w:numId w:val="1"/>
+        </w:numPr>
+        <w:rPr>
+          <w:b/>
+          <w:bCs/>
+        </w:rPr>
+      </w:pPr>
+      <w:r>
+        <w:rPr>
+          <w:b/>
+          <w:bCs/>
+        </w:rPr>
+        <w:t xml:space="preserve">Add filter box in team in admin using list_filter = by first name or designation </w:t>
+      </w:r>
+    </w:p>
+    <w:p>
+      <w:pPr>
+        <w:pStyle w:val="ListParagraph"/>
+        <w:rPr>
+          <w:b/>
+          <w:bCs/>
+          <w:rtl/>
+        </w:rPr>
+      </w:pPr>
+      <w:r>
+        <w:rPr>
+          <w:noProof/>
+        </w:rPr>
+        <w:drawing>
+          <wp:inline distT="0" distB="0" distL="0" distR="0" wp14:anchorId="0D555134" wp14:editId="34E2F2EC">
+            <wp:extent cx="2642870" cy="199173"/>
+            <wp:effectExtent l="0" t="0" r="0" b="0"/>
+            <wp:docPr id="35" name="Picture 35"/>
+            <wp:cNvGraphicFramePr>
+              <a:graphicFrameLocks xmlns:a="http://schemas.openxmlformats.org/drawingml/2006/main" noChangeAspect="1"/>
+            </wp:cNvGraphicFramePr>
+            <a:graphic xmlns:a="http://schemas.openxmlformats.org/drawingml/2006/main">
+              <a:graphicData uri="http://schemas.openxmlformats.org/drawingml/2006/picture">
+                <pic:pic xmlns:pic="http://schemas.openxmlformats.org/drawingml/2006/picture">
+                  <pic:nvPicPr>
+                    <pic:cNvPr id="1" name=""/>
+                    <pic:cNvPicPr/>
+                  </pic:nvPicPr>
+                  <pic:blipFill>
+                    <a:blip r:embed="rId37"/>
+                    <a:stretch>
+                      <a:fillRect/>
+                    </a:stretch>
+                  </pic:blipFill>
+                  <pic:spPr>
+                    <a:xfrm>
+                      <a:off x="0" y="0"/>
+                      <a:ext cx="2814868" cy="212135"/>
+                    </a:xfrm>
+                    <a:prstGeom prst="rect">
+                      <a:avLst/>
+                    </a:prstGeom>
+                  </pic:spPr>
+                </pic:pic>
+              </a:graphicData>
+            </a:graphic>
+          </wp:inline>
+        </w:drawing>
+      </w:r>
+    </w:p>
+    <w:p>
+      <w:pPr>
+        <w:pStyle w:val="ListParagraph"/>
+        <w:numPr>
+          <w:ilvl w:val="0"/>
+          <w:numId w:val="1"/>
+        </w:numPr>
+        <w:rPr>
+          <w:b/>
+          <w:bCs/>
+        </w:rPr>
+      </w:pPr>
+      <w:r>
+        <w:rPr>
+          <w:b/>
+          <w:bCs/>
+        </w:rPr>
+        <w:t xml:space="preserve">To change the year of </w:t>
+      </w:r>
+      <w:r>
+        <w:rPr>
+          <w:b/>
+          <w:bCs/>
+        </w:rPr>
+        <w:t>All Rights Reserved</w:t>
+      </w:r>
+      <w:r>
+        <w:rPr>
+          <w:b/>
+          <w:bCs/>
+        </w:rPr>
+        <w:t xml:space="preserve"> to be dynamic use {% now ‘Y’ %}</w:t>
+      </w:r>
+    </w:p>
+    <w:p>
+      <w:pPr>
+        <w:pStyle w:val="ListParagraph"/>
+        <w:numPr>
+          <w:ilvl w:val="0"/>
+          <w:numId w:val="1"/>
+        </w:numPr>
+        <w:rPr>
+          <w:b/>
+          <w:bCs/>
+        </w:rPr>
+      </w:pPr>
+      <w:r>
+        <w:rPr>
+          <w:b/>
+          <w:bCs/>
+        </w:rPr>
+        <w:t xml:space="preserve">Highlighted the page you are on </w:t>
+      </w:r>
+      <w:r>
+        <w:rPr>
+          <w:b/>
+          <w:bCs/>
+        </w:rPr>
+        <w:t xml:space="preserve">home different than other page: </w:t>
+      </w:r>
+      <w:r>
+        <w:rPr>
+          <w:noProof/>
+        </w:rPr>
+        <w:drawing>
+          <wp:inline distT="0" distB="0" distL="0" distR="0" wp14:anchorId="0AF0EF4B" wp14:editId="2A76039B">
+            <wp:extent cx="1695132" cy="2160615"/>
+            <wp:effectExtent l="0" t="0" r="635" b="0"/>
+            <wp:docPr id="37" name="Picture 37"/>
+            <wp:cNvGraphicFramePr>
+              <a:graphicFrameLocks xmlns:a="http://schemas.openxmlformats.org/drawingml/2006/main" noChangeAspect="1"/>
+            </wp:cNvGraphicFramePr>
+            <a:graphic xmlns:a="http://schemas.openxmlformats.org/drawingml/2006/main">
+              <a:graphicData uri="http://schemas.openxmlformats.org/drawingml/2006/picture">
+                <pic:pic xmlns:pic="http://schemas.openxmlformats.org/drawingml/2006/picture">
+                  <pic:nvPicPr>
+                    <pic:cNvPr id="1" name=""/>
+                    <pic:cNvPicPr/>
+                  </pic:nvPicPr>
+                  <pic:blipFill>
+                    <a:blip r:embed="rId38"/>
+                    <a:stretch>
+                      <a:fillRect/>
+                    </a:stretch>
+                  </pic:blipFill>
+                  <pic:spPr>
+                    <a:xfrm>
+                      <a:off x="0" y="0"/>
+                      <a:ext cx="1707612" cy="2176522"/>
+                    </a:xfrm>
+                    <a:prstGeom prst="rect">
+                      <a:avLst/>
+                    </a:prstGeom>
+                  </pic:spPr>
+                </pic:pic>
+              </a:graphicData>
+            </a:graphic>
+          </wp:inline>
+        </w:drawing>
+      </w:r>
+    </w:p>
+    <w:p>
+      <w:pPr>
+        <w:pStyle w:val="ListParagraph"/>
+        <w:numPr>
+          <w:ilvl w:val="0"/>
+          <w:numId w:val="1"/>
+        </w:numPr>
+        <w:rPr>
+          <w:b/>
+          <w:bCs/>
+        </w:rPr>
+      </w:pPr>
+      <w:r>
+        <w:rPr>
+          <w:b/>
+          <w:bCs/>
+        </w:rPr>
+        <w:t>Create new app Calles cars</w:t>
+      </w:r>
+    </w:p>
+    <w:p>
+      <w:pPr>
+        <w:pStyle w:val="ListParagraph"/>
+        <w:rPr>
+          <w:b/>
+          <w:bCs/>
+        </w:rPr>
+      </w:pPr>
+      <w:r>
+        <w:rPr>
+          <w:noProof/>
+        </w:rPr>
+        <w:drawing>
+          <wp:inline distT="0" distB="0" distL="0" distR="0" wp14:anchorId="18AEEBF8" wp14:editId="76C63824">
+            <wp:extent cx="2485672" cy="123825"/>
+            <wp:effectExtent l="0" t="0" r="0" b="0"/>
+            <wp:docPr id="39" name="Picture 39"/>
+            <wp:cNvGraphicFramePr>
+              <a:graphicFrameLocks xmlns:a="http://schemas.openxmlformats.org/drawingml/2006/main" noChangeAspect="1"/>
+            </wp:cNvGraphicFramePr>
+            <a:graphic xmlns:a="http://schemas.openxmlformats.org/drawingml/2006/main">
+              <a:graphicData uri="http://schemas.openxmlformats.org/drawingml/2006/picture">
+                <pic:pic xmlns:pic="http://schemas.openxmlformats.org/drawingml/2006/picture">
+                  <pic:nvPicPr>
+                    <pic:cNvPr id="1" name=""/>
+                    <pic:cNvPicPr/>
+                  </pic:nvPicPr>
+                  <pic:blipFill>
+                    <a:blip r:embed="rId39"/>
+                    <a:stretch>
+                      <a:fillRect/>
+                    </a:stretch>
+                  </pic:blipFill>
+                  <pic:spPr>
+                    <a:xfrm>
+                      <a:off x="0" y="0"/>
+                      <a:ext cx="2519385" cy="125504"/>
+                    </a:xfrm>
+                    <a:prstGeom prst="rect">
+                      <a:avLst/>
+                    </a:prstGeom>
+                  </pic:spPr>
+                </pic:pic>
+              </a:graphicData>
+            </a:graphic>
+          </wp:inline>
+        </w:drawing>
+      </w:r>
+      <w:r>
+        <w:rPr>
+          <w:b/>
+          <w:bCs/>
+        </w:rPr>
+        <w:t xml:space="preserve"> </w:t>
+      </w:r>
+    </w:p>
+    <w:p>
+      <w:pPr>
+        <w:pStyle w:val="ListParagraph"/>
+        <w:numPr>
+          <w:ilvl w:val="0"/>
+          <w:numId w:val="1"/>
+        </w:numPr>
+        <w:rPr>
+          <w:b/>
+          <w:bCs/>
+        </w:rPr>
+      </w:pPr>
+      <w:r>
+        <w:rPr>
+          <w:b/>
+          <w:bCs/>
+        </w:rPr>
+        <w:t xml:space="preserve">Add the app inside the setting of the carzone file </w:t>
+      </w:r>
+    </w:p>
+    <w:p>
+      <w:pPr>
+        <w:pStyle w:val="ListParagraph"/>
+        <w:rPr>
+          <w:b/>
+          <w:bCs/>
+        </w:rPr>
+      </w:pPr>
+      <w:r>
+        <w:rPr>
+          <w:noProof/>
+        </w:rPr>
+        <w:drawing>
+          <wp:inline distT="0" distB="0" distL="0" distR="0" wp14:anchorId="2CC5A59C" wp14:editId="3FF32EB1">
+            <wp:extent cx="2772503" cy="390525"/>
+            <wp:effectExtent l="0" t="0" r="8890" b="0"/>
+            <wp:docPr id="40" name="Picture 40"/>
+            <wp:cNvGraphicFramePr>
+              <a:graphicFrameLocks xmlns:a="http://schemas.openxmlformats.org/drawingml/2006/main" noChangeAspect="1"/>
+            </wp:cNvGraphicFramePr>
+            <a:graphic xmlns:a="http://schemas.openxmlformats.org/drawingml/2006/main">
+              <a:graphicData uri="http://schemas.openxmlformats.org/drawingml/2006/picture">
+                <pic:pic xmlns:pic="http://schemas.openxmlformats.org/drawingml/2006/picture">
+                  <pic:nvPicPr>
+                    <pic:cNvPr id="1" name=""/>
+                    <pic:cNvPicPr/>
+                  </pic:nvPicPr>
+                  <pic:blipFill>
+                    <a:blip r:embed="rId40"/>
+                    <a:stretch>
+                      <a:fillRect/>
+                    </a:stretch>
+                  </pic:blipFill>
+                  <pic:spPr>
+                    <a:xfrm>
+                      <a:off x="0" y="0"/>
+                      <a:ext cx="2857815" cy="402542"/>
+                    </a:xfrm>
+                    <a:prstGeom prst="rect">
+                      <a:avLst/>
+                    </a:prstGeom>
+                  </pic:spPr>
+                </pic:pic>
+              </a:graphicData>
+            </a:graphic>
+          </wp:inline>
+        </w:drawing>
+      </w:r>
+    </w:p>
+    <w:p>
+      <w:pPr>
+        <w:pStyle w:val="ListParagraph"/>
+        <w:numPr>
+          <w:ilvl w:val="0"/>
+          <w:numId w:val="1"/>
+        </w:numPr>
+        <w:rPr>
+          <w:b/>
+          <w:bCs/>
+        </w:rPr>
+      </w:pPr>
+      <w:r>
+        <w:rPr>
+          <w:b/>
+          <w:bCs/>
+        </w:rPr>
+        <w:t xml:space="preserve">Add urls.py inside the cars </w:t>
+      </w:r>
+    </w:p>
+    <w:p>
+      <w:pPr>
+        <w:pStyle w:val="ListParagraph"/>
+        <w:rPr>
+          <w:b/>
+          <w:bCs/>
+        </w:rPr>
+      </w:pPr>
+      <w:r>
+        <w:rPr>
+          <w:noProof/>
+        </w:rPr>
+        <w:drawing>
+          <wp:inline distT="0" distB="0" distL="0" distR="0" wp14:anchorId="711F4EE2" wp14:editId="70FF230C">
+            <wp:extent cx="2779776" cy="361950"/>
+            <wp:effectExtent l="0" t="0" r="1905" b="0"/>
+            <wp:docPr id="44" name="Picture 44"/>
+            <wp:cNvGraphicFramePr>
+              <a:graphicFrameLocks xmlns:a="http://schemas.openxmlformats.org/drawingml/2006/main" noChangeAspect="1"/>
+            </wp:cNvGraphicFramePr>
+            <a:graphic xmlns:a="http://schemas.openxmlformats.org/drawingml/2006/main">
+              <a:graphicData uri="http://schemas.openxmlformats.org/drawingml/2006/picture">
+                <pic:pic xmlns:pic="http://schemas.openxmlformats.org/drawingml/2006/picture">
+                  <pic:nvPicPr>
+                    <pic:cNvPr id="1" name=""/>
+                    <pic:cNvPicPr/>
+                  </pic:nvPicPr>
+                  <pic:blipFill>
+                    <a:blip r:embed="rId41"/>
+                    <a:stretch>
+                      <a:fillRect/>
+                    </a:stretch>
+                  </pic:blipFill>
+                  <pic:spPr>
+                    <a:xfrm>
+                      <a:off x="0" y="0"/>
+                      <a:ext cx="2845395" cy="370494"/>
+                    </a:xfrm>
+                    <a:prstGeom prst="rect">
+                      <a:avLst/>
+                    </a:prstGeom>
+                  </pic:spPr>
+                </pic:pic>
+              </a:graphicData>
+            </a:graphic>
+          </wp:inline>
+        </w:drawing>
+      </w:r>
+    </w:p>
+    <w:p>
+      <w:pPr>
+        <w:pStyle w:val="ListParagraph"/>
+        <w:numPr>
+          <w:ilvl w:val="0"/>
+          <w:numId w:val="1"/>
+        </w:numPr>
+        <w:rPr>
+          <w:b/>
+          <w:bCs/>
+        </w:rPr>
+      </w:pPr>
+      <w:r>
+        <w:rPr>
+          <w:b/>
+          <w:bCs/>
+        </w:rPr>
+        <w:t xml:space="preserve">Inside urls.py for carzone add the cars.urls </w:t>
+      </w:r>
+    </w:p>
+    <w:p>
+      <w:pPr>
+        <w:pStyle w:val="ListParagraph"/>
+        <w:rPr>
+          <w:b/>
+          <w:bCs/>
+        </w:rPr>
+      </w:pPr>
+      <w:r>
+        <w:rPr>
+          <w:noProof/>
+        </w:rPr>
+        <w:drawing>
+          <wp:inline distT="0" distB="0" distL="0" distR="0" wp14:anchorId="1AD529D9" wp14:editId="4ABF7093">
+            <wp:extent cx="2772410" cy="381527"/>
+            <wp:effectExtent l="0" t="0" r="0" b="0"/>
+            <wp:docPr id="41" name="Picture 41"/>
+            <wp:cNvGraphicFramePr>
+              <a:graphicFrameLocks xmlns:a="http://schemas.openxmlformats.org/drawingml/2006/main" noChangeAspect="1"/>
+            </wp:cNvGraphicFramePr>
+            <a:graphic xmlns:a="http://schemas.openxmlformats.org/drawingml/2006/main">
+              <a:graphicData uri="http://schemas.openxmlformats.org/drawingml/2006/picture">
+                <pic:pic xmlns:pic="http://schemas.openxmlformats.org/drawingml/2006/picture">
+                  <pic:nvPicPr>
+                    <pic:cNvPr id="1" name=""/>
+                    <pic:cNvPicPr/>
+                  </pic:nvPicPr>
+                  <pic:blipFill>
+                    <a:blip r:embed="rId42"/>
+                    <a:stretch>
+                      <a:fillRect/>
+                    </a:stretch>
+                  </pic:blipFill>
+                  <pic:spPr>
+                    <a:xfrm>
+                      <a:off x="0" y="0"/>
+                      <a:ext cx="2815430" cy="387447"/>
+                    </a:xfrm>
+                    <a:prstGeom prst="rect">
+                      <a:avLst/>
+                    </a:prstGeom>
+                  </pic:spPr>
+                </pic:pic>
+              </a:graphicData>
+            </a:graphic>
+          </wp:inline>
+        </w:drawing>
+      </w:r>
+    </w:p>
+    <w:p>
+      <w:pPr>
+        <w:pStyle w:val="ListParagraph"/>
+        <w:numPr>
+          <w:ilvl w:val="0"/>
+          <w:numId w:val="1"/>
+        </w:numPr>
+        <w:rPr>
+          <w:b/>
+          <w:bCs/>
+        </w:rPr>
+      </w:pPr>
+      <w:r>
+        <w:rPr>
+          <w:b/>
+          <w:bCs/>
+        </w:rPr>
+        <w:t>In the view.py make function cars</w:t>
+      </w:r>
+    </w:p>
+    <w:p>
+      <w:pPr>
+        <w:pStyle w:val="ListParagraph"/>
+        <w:rPr>
+          <w:b/>
+          <w:bCs/>
+        </w:rPr>
+      </w:pPr>
+      <w:r>
+        <w:rPr>
+          <w:noProof/>
+        </w:rPr>
+        <w:drawing>
+          <wp:inline distT="0" distB="0" distL="0" distR="0" wp14:anchorId="0C085CE0" wp14:editId="5B8698E1">
+            <wp:extent cx="2714622" cy="452437"/>
+            <wp:effectExtent l="0" t="0" r="0" b="5080"/>
+            <wp:docPr id="42" name="Picture 42"/>
+            <wp:cNvGraphicFramePr>
+              <a:graphicFrameLocks xmlns:a="http://schemas.openxmlformats.org/drawingml/2006/main" noChangeAspect="1"/>
+            </wp:cNvGraphicFramePr>
+            <a:graphic xmlns:a="http://schemas.openxmlformats.org/drawingml/2006/main">
+              <a:graphicData uri="http://schemas.openxmlformats.org/drawingml/2006/picture">
+                <pic:pic xmlns:pic="http://schemas.openxmlformats.org/drawingml/2006/picture">
+                  <pic:nvPicPr>
+                    <pic:cNvPr id="1" name=""/>
+                    <pic:cNvPicPr/>
+                  </pic:nvPicPr>
+                  <pic:blipFill>
+                    <a:blip r:embed="rId43"/>
+                    <a:stretch>
+                      <a:fillRect/>
+                    </a:stretch>
+                  </pic:blipFill>
+                  <pic:spPr>
+                    <a:xfrm>
+                      <a:off x="0" y="0"/>
+                      <a:ext cx="2746714" cy="457786"/>
+                    </a:xfrm>
+                    <a:prstGeom prst="rect">
+                      <a:avLst/>
+                    </a:prstGeom>
+                  </pic:spPr>
+                </pic:pic>
+              </a:graphicData>
+            </a:graphic>
+          </wp:inline>
+        </w:drawing>
+      </w:r>
+    </w:p>
+    <w:p>
+      <w:pPr>
+        <w:pStyle w:val="ListParagraph"/>
+        <w:numPr>
+          <w:ilvl w:val="0"/>
+          <w:numId w:val="1"/>
+        </w:numPr>
+        <w:rPr>
+          <w:b/>
+          <w:bCs/>
+        </w:rPr>
+      </w:pPr>
+      <w:r>
+        <w:rPr>
+          <w:b/>
+          <w:bCs/>
+        </w:rPr>
+        <w:t>Create cars.html inside template-&gt; pages -&gt; cars-&gt;cars.html</w:t>
+      </w:r>
+    </w:p>
+    <w:p>
+      <w:pPr>
+        <w:pStyle w:val="ListParagraph"/>
+        <w:numPr>
+          <w:ilvl w:val="0"/>
+          <w:numId w:val="1"/>
+        </w:numPr>
+        <w:rPr>
+          <w:b/>
+          <w:bCs/>
+        </w:rPr>
+      </w:pPr>
+      <w:r>
+        <w:rPr>
+          <w:b/>
+          <w:bCs/>
+        </w:rPr>
+        <w:t>Fix the cars.html by removing NAV and Footer and some top bar</w:t>
+      </w:r>
+    </w:p>
+    <w:p>
+      <w:pPr>
+        <w:pStyle w:val="ListParagraph"/>
+        <w:numPr>
+          <w:ilvl w:val="0"/>
+          <w:numId w:val="1"/>
+        </w:numPr>
+        <w:rPr>
+          <w:b/>
+          <w:bCs/>
+        </w:rPr>
+      </w:pPr>
+      <w:r>
+        <w:rPr>
+          <w:b/>
+          <w:bCs/>
+        </w:rPr>
+        <w:t xml:space="preserve">Fix all links and images </w:t>
+      </w:r>
+    </w:p>
+    <w:p>
+      <w:pPr>
+        <w:rPr>
+          <w:b/>
+          <w:bCs/>
+        </w:rPr>
+      </w:pPr>
+    </w:p>
+    <w:p>
+      <w:pPr>
+        <w:rPr>
+          <w:b/>
+          <w:bCs/>
+        </w:rPr>
+      </w:pPr>
+    </w:p>
+    <w:p>
+      <w:pPr>
+        <w:rPr>
+          <w:b/>
+          <w:bCs/>
+        </w:rPr>
+      </w:pPr>
+    </w:p>
+    <w:p>
+      <w:pPr>
+        <w:rPr>
+          <w:b/>
+          <w:bCs/>
+        </w:rPr>
+      </w:pPr>
+    </w:p>
+    <w:p>
+      <w:pPr>
+        <w:pStyle w:val="ListParagraph"/>
+        <w:numPr>
+          <w:ilvl w:val="0"/>
+          <w:numId w:val="1"/>
+        </w:numPr>
+        <w:rPr>
+          <w:b/>
+          <w:bCs/>
+        </w:rPr>
+      </w:pPr>
+      <w:r>
+        <w:rPr>
+          <w:b/>
+          <w:bCs/>
+        </w:rPr>
+        <w:lastRenderedPageBreak/>
+        <w:t>Create Cars module in models.py</w:t>
+      </w:r>
+    </w:p>
+    <w:p>
+      <w:pPr>
+        <w:pStyle w:val="ListParagraph"/>
+        <w:rPr>
+          <w:b/>
+          <w:bCs/>
+        </w:rPr>
+      </w:pPr>
+      <w:r>
+        <w:rPr>
+          <w:noProof/>
+        </w:rPr>
+        <w:drawing>
+          <wp:inline distT="0" distB="0" distL="0" distR="0" wp14:anchorId="056DF4E1" wp14:editId="4A26B841">
+            <wp:extent cx="2616713" cy="1766887"/>
+            <wp:effectExtent l="0" t="0" r="0" b="5080"/>
+            <wp:docPr id="33" name="Picture 33"/>
+            <wp:cNvGraphicFramePr>
+              <a:graphicFrameLocks xmlns:a="http://schemas.openxmlformats.org/drawingml/2006/main" noChangeAspect="1"/>
+            </wp:cNvGraphicFramePr>
+            <a:graphic xmlns:a="http://schemas.openxmlformats.org/drawingml/2006/main">
+              <a:graphicData uri="http://schemas.openxmlformats.org/drawingml/2006/picture">
+                <pic:pic xmlns:pic="http://schemas.openxmlformats.org/drawingml/2006/picture">
+                  <pic:nvPicPr>
+                    <pic:cNvPr id="1" name=""/>
+                    <pic:cNvPicPr/>
+                  </pic:nvPicPr>
+                  <pic:blipFill>
+                    <a:blip r:embed="rId44"/>
+                    <a:stretch>
+                      <a:fillRect/>
+                    </a:stretch>
+                  </pic:blipFill>
+                  <pic:spPr>
+                    <a:xfrm>
+                      <a:off x="0" y="0"/>
+                      <a:ext cx="2631346" cy="1776768"/>
+                    </a:xfrm>
+                    <a:prstGeom prst="rect">
+                      <a:avLst/>
+                    </a:prstGeom>
+                  </pic:spPr>
+                </pic:pic>
+              </a:graphicData>
+            </a:graphic>
+          </wp:inline>
+        </w:drawing>
+      </w:r>
+    </w:p>
+    <w:p>
+      <w:pPr>
+        <w:pStyle w:val="ListParagraph"/>
+        <w:numPr>
+          <w:ilvl w:val="0"/>
+          <w:numId w:val="1"/>
+        </w:numPr>
+        <w:rPr>
+          <w:b/>
+          <w:bCs/>
+        </w:rPr>
+      </w:pPr>
+      <w:r>
+        <w:rPr>
+          <w:b/>
+          <w:bCs/>
+        </w:rPr>
+        <w:t>Register it in the admin.py</w:t>
+      </w:r>
+    </w:p>
+    <w:p>
+      <w:pPr>
+        <w:pStyle w:val="ListParagraph"/>
+        <w:rPr>
+          <w:b/>
+          <w:bCs/>
+        </w:rPr>
+      </w:pPr>
+      <w:r>
+        <w:rPr>
+          <w:noProof/>
+        </w:rPr>
+        <w:drawing>
+          <wp:inline distT="0" distB="0" distL="0" distR="0" wp14:anchorId="709F05D3" wp14:editId="2D58428F">
+            <wp:extent cx="2628900" cy="813316"/>
+            <wp:effectExtent l="0" t="0" r="0" b="6350"/>
+            <wp:docPr id="30" name="Picture 30"/>
+            <wp:cNvGraphicFramePr>
+              <a:graphicFrameLocks xmlns:a="http://schemas.openxmlformats.org/drawingml/2006/main" noChangeAspect="1"/>
+            </wp:cNvGraphicFramePr>
+            <a:graphic xmlns:a="http://schemas.openxmlformats.org/drawingml/2006/main">
+              <a:graphicData uri="http://schemas.openxmlformats.org/drawingml/2006/picture">
+                <pic:pic xmlns:pic="http://schemas.openxmlformats.org/drawingml/2006/picture">
+                  <pic:nvPicPr>
+                    <pic:cNvPr id="1" name=""/>
+                    <pic:cNvPicPr/>
+                  </pic:nvPicPr>
+                  <pic:blipFill>
+                    <a:blip r:embed="rId45"/>
+                    <a:stretch>
+                      <a:fillRect/>
+                    </a:stretch>
+                  </pic:blipFill>
+                  <pic:spPr>
+                    <a:xfrm>
+                      <a:off x="0" y="0"/>
+                      <a:ext cx="2667250" cy="825181"/>
+                    </a:xfrm>
+                    <a:prstGeom prst="rect">
+                      <a:avLst/>
+                    </a:prstGeom>
+                  </pic:spPr>
+                </pic:pic>
+              </a:graphicData>
+            </a:graphic>
+          </wp:inline>
+        </w:drawing>
+      </w:r>
+    </w:p>
+    <w:p>
+      <w:pPr>
+        <w:pStyle w:val="ListParagraph"/>
+        <w:numPr>
+          <w:ilvl w:val="0"/>
+          <w:numId w:val="1"/>
+        </w:numPr>
+        <w:rPr>
+          <w:b/>
+          <w:bCs/>
+        </w:rPr>
+      </w:pPr>
+      <w:r>
+        <w:rPr>
+          <w:b/>
+          <w:bCs/>
+        </w:rPr>
+        <w:t xml:space="preserve">Run makmigrations and migrate  </w:t>
+      </w:r>
+    </w:p>
+    <w:p>
+      <w:pPr>
+        <w:pStyle w:val="ListParagraph"/>
+        <w:numPr>
+          <w:ilvl w:val="0"/>
+          <w:numId w:val="1"/>
+        </w:numPr>
+        <w:rPr>
+          <w:b/>
+          <w:bCs/>
+        </w:rPr>
+      </w:pPr>
+      <w:r>
+        <w:rPr>
+          <w:b/>
+          <w:bCs/>
+        </w:rPr>
+        <w:t>Change the textrich to have alignment tools by installing Django-ckeditor</w:t>
+      </w:r>
+    </w:p>
+    <w:p>
+      <w:pPr>
+        <w:pStyle w:val="ListParagraph"/>
+        <w:rPr>
+          <w:b/>
+          <w:bCs/>
+        </w:rPr>
+      </w:pPr>
+      <w:r>
+        <w:rPr>
+          <w:noProof/>
+        </w:rPr>
+        <w:drawing>
+          <wp:inline distT="0" distB="0" distL="0" distR="0" wp14:anchorId="5402662F" wp14:editId="3D0C52AA">
+            <wp:extent cx="2681288" cy="371564"/>
+            <wp:effectExtent l="0" t="0" r="5080" b="9525"/>
+            <wp:docPr id="28" name="Picture 28"/>
+            <wp:cNvGraphicFramePr>
+              <a:graphicFrameLocks xmlns:a="http://schemas.openxmlformats.org/drawingml/2006/main" noChangeAspect="1"/>
+            </wp:cNvGraphicFramePr>
+            <a:graphic xmlns:a="http://schemas.openxmlformats.org/drawingml/2006/main">
+              <a:graphicData uri="http://schemas.openxmlformats.org/drawingml/2006/picture">
+                <pic:pic xmlns:pic="http://schemas.openxmlformats.org/drawingml/2006/picture">
+                  <pic:nvPicPr>
+                    <pic:cNvPr id="1" name=""/>
+                    <pic:cNvPicPr/>
+                  </pic:nvPicPr>
+                  <pic:blipFill>
+                    <a:blip r:embed="rId46"/>
+                    <a:stretch>
+                      <a:fillRect/>
+                    </a:stretch>
+                  </pic:blipFill>
+                  <pic:spPr>
+                    <a:xfrm>
+                      <a:off x="0" y="0"/>
+                      <a:ext cx="2743045" cy="380122"/>
+                    </a:xfrm>
+                    <a:prstGeom prst="rect">
+                      <a:avLst/>
+                    </a:prstGeom>
+                  </pic:spPr>
+                </pic:pic>
+              </a:graphicData>
+            </a:graphic>
+          </wp:inline>
+        </w:drawing>
+      </w:r>
+      <w:r>
+        <w:rPr>
+          <w:b/>
+          <w:bCs/>
+        </w:rPr>
+        <w:t xml:space="preserve"> </w:t>
+      </w:r>
+    </w:p>
+    <w:p>
+      <w:pPr>
+        <w:pStyle w:val="ListParagraph"/>
+        <w:numPr>
+          <w:ilvl w:val="0"/>
+          <w:numId w:val="1"/>
+        </w:numPr>
+        <w:rPr>
+          <w:b/>
+          <w:bCs/>
+        </w:rPr>
+      </w:pPr>
+      <w:r>
+        <w:rPr>
+          <w:b/>
+          <w:bCs/>
+        </w:rPr>
+        <w:t>Add the ckeditor to installed app in setting.py</w:t>
+      </w:r>
+    </w:p>
+    <w:p>
+      <w:pPr>
+        <w:pStyle w:val="ListParagraph"/>
+        <w:rPr>
+          <w:b/>
+          <w:bCs/>
+        </w:rPr>
+      </w:pPr>
+      <w:r>
+        <w:rPr>
+          <w:noProof/>
+        </w:rPr>
+        <w:drawing>
+          <wp:inline distT="0" distB="0" distL="0" distR="0" wp14:anchorId="420CC6A7" wp14:editId="406E9BDA">
+            <wp:extent cx="1247775" cy="954976"/>
+            <wp:effectExtent l="0" t="0" r="0" b="0"/>
+            <wp:docPr id="36" name="Picture 36"/>
+            <wp:cNvGraphicFramePr>
+              <a:graphicFrameLocks xmlns:a="http://schemas.openxmlformats.org/drawingml/2006/main" noChangeAspect="1"/>
+            </wp:cNvGraphicFramePr>
+            <a:graphic xmlns:a="http://schemas.openxmlformats.org/drawingml/2006/main">
+              <a:graphicData uri="http://schemas.openxmlformats.org/drawingml/2006/picture">
+                <pic:pic xmlns:pic="http://schemas.openxmlformats.org/drawingml/2006/picture">
+                  <pic:nvPicPr>
+                    <pic:cNvPr id="1" name=""/>
+                    <pic:cNvPicPr/>
+                  </pic:nvPicPr>
+                  <pic:blipFill>
+                    <a:blip r:embed="rId47"/>
+                    <a:stretch>
+                      <a:fillRect/>
+                    </a:stretch>
+                  </pic:blipFill>
+                  <pic:spPr>
+                    <a:xfrm>
+                      <a:off x="0" y="0"/>
+                      <a:ext cx="1294046" cy="990389"/>
+                    </a:xfrm>
+                    <a:prstGeom prst="rect">
+                      <a:avLst/>
+                    </a:prstGeom>
+                  </pic:spPr>
+                </pic:pic>
+              </a:graphicData>
+            </a:graphic>
+          </wp:inline>
+        </w:drawing>
+      </w:r>
+    </w:p>
+    <w:p>
+      <w:pPr>
+        <w:pStyle w:val="ListParagraph"/>
+        <w:numPr>
+          <w:ilvl w:val="0"/>
+          <w:numId w:val="1"/>
+        </w:numPr>
+        <w:rPr>
+          <w:b/>
+          <w:bCs/>
+        </w:rPr>
+      </w:pPr>
+      <w:r>
+        <w:rPr>
+          <w:b/>
+          <w:bCs/>
+        </w:rPr>
+        <w:t xml:space="preserve">Go to model.py import </w:t>
+      </w:r>
+      <w:r>
+        <w:rPr>
+          <w:b/>
+          <w:bCs/>
+        </w:rPr>
+        <w:t xml:space="preserve">ckeditor </w:t>
+      </w:r>
+      <w:r>
+        <w:rPr>
+          <w:b/>
+          <w:bCs/>
+        </w:rPr>
+        <w:t xml:space="preserve">and fix the rich box instead the textfiled </w:t>
+      </w:r>
+    </w:p>
+    <w:p>
+      <w:pPr>
+        <w:pStyle w:val="ListParagraph"/>
+        <w:rPr>
+          <w:b/>
+          <w:bCs/>
+        </w:rPr>
+      </w:pPr>
+      <w:r>
+        <w:rPr>
+          <w:noProof/>
+        </w:rPr>
+        <w:drawing>
+          <wp:inline distT="0" distB="0" distL="0" distR="0" wp14:anchorId="77E322D3" wp14:editId="6D6DEF7D">
+            <wp:extent cx="1476375" cy="99580"/>
+            <wp:effectExtent l="0" t="0" r="0" b="0"/>
+            <wp:docPr id="38" name="Picture 38"/>
+            <wp:cNvGraphicFramePr>
+              <a:graphicFrameLocks xmlns:a="http://schemas.openxmlformats.org/drawingml/2006/main" noChangeAspect="1"/>
+            </wp:cNvGraphicFramePr>
+            <a:graphic xmlns:a="http://schemas.openxmlformats.org/drawingml/2006/main">
+              <a:graphicData uri="http://schemas.openxmlformats.org/drawingml/2006/picture">
+                <pic:pic xmlns:pic="http://schemas.openxmlformats.org/drawingml/2006/picture">
+                  <pic:nvPicPr>
+                    <pic:cNvPr id="1" name=""/>
+                    <pic:cNvPicPr/>
+                  </pic:nvPicPr>
+                  <pic:blipFill>
+                    <a:blip r:embed="rId48"/>
+                    <a:stretch>
+                      <a:fillRect/>
+                    </a:stretch>
+                  </pic:blipFill>
+                  <pic:spPr>
+                    <a:xfrm>
+                      <a:off x="0" y="0"/>
+                      <a:ext cx="1580404" cy="106597"/>
+                    </a:xfrm>
+                    <a:prstGeom prst="rect">
+                      <a:avLst/>
+                    </a:prstGeom>
+                  </pic:spPr>
+                </pic:pic>
+              </a:graphicData>
+            </a:graphic>
+          </wp:inline>
+        </w:drawing>
+      </w:r>
+    </w:p>
+    <w:p>
+      <w:pPr>
+        <w:pStyle w:val="ListParagraph"/>
+        <w:rPr>
+          <w:b/>
+          <w:bCs/>
+        </w:rPr>
+      </w:pPr>
+      <w:r>
+        <w:rPr>
+          <w:noProof/>
+        </w:rPr>
+        <w:drawing>
+          <wp:inline distT="0" distB="0" distL="0" distR="0" wp14:anchorId="4D5216AA" wp14:editId="31F6BBB6">
+            <wp:extent cx="1476375" cy="139400"/>
+            <wp:effectExtent l="0" t="0" r="0" b="0"/>
+            <wp:docPr id="45" name="Picture 45"/>
+            <wp:cNvGraphicFramePr>
+              <a:graphicFrameLocks xmlns:a="http://schemas.openxmlformats.org/drawingml/2006/main" noChangeAspect="1"/>
+            </wp:cNvGraphicFramePr>
+            <a:graphic xmlns:a="http://schemas.openxmlformats.org/drawingml/2006/main">
+              <a:graphicData uri="http://schemas.openxmlformats.org/drawingml/2006/picture">
+                <pic:pic xmlns:pic="http://schemas.openxmlformats.org/drawingml/2006/picture">
+                  <pic:nvPicPr>
+                    <pic:cNvPr id="1" name=""/>
+                    <pic:cNvPicPr/>
+                  </pic:nvPicPr>
+                  <pic:blipFill>
+                    <a:blip r:embed="rId49"/>
+                    <a:stretch>
+                      <a:fillRect/>
+                    </a:stretch>
+                  </pic:blipFill>
+                  <pic:spPr>
+                    <a:xfrm>
+                      <a:off x="0" y="0"/>
+                      <a:ext cx="1730140" cy="163361"/>
+                    </a:xfrm>
+                    <a:prstGeom prst="rect">
+                      <a:avLst/>
+                    </a:prstGeom>
+                  </pic:spPr>
+                </pic:pic>
+              </a:graphicData>
+            </a:graphic>
+          </wp:inline>
+        </w:drawing>
+      </w:r>
+    </w:p>
+    <w:p>
+      <w:pPr>
+        <w:pStyle w:val="ListParagraph"/>
+        <w:numPr>
+          <w:ilvl w:val="0"/>
+          <w:numId w:val="1"/>
+        </w:numPr>
+        <w:rPr>
+          <w:b/>
+          <w:bCs/>
+        </w:rPr>
+      </w:pPr>
+      <w:r>
+        <w:rPr>
+          <w:b/>
+          <w:bCs/>
+        </w:rPr>
+        <w:t xml:space="preserve">Edit features to be able to select multiple items </w:t>
+      </w:r>
+    </w:p>
+    <w:p>
+      <w:pPr>
+        <w:pStyle w:val="ListParagraph"/>
+        <w:rPr>
+          <w:b/>
+          <w:bCs/>
+        </w:rPr>
+      </w:pPr>
+      <w:r>
+        <w:rPr>
+          <w:noProof/>
+        </w:rPr>
+        <w:drawing>
+          <wp:inline distT="0" distB="0" distL="0" distR="0" wp14:anchorId="0251B71B" wp14:editId="1B497A04">
+            <wp:extent cx="1476375" cy="89724"/>
+            <wp:effectExtent l="0" t="0" r="0" b="5715"/>
+            <wp:docPr id="46" name="Picture 46"/>
+            <wp:cNvGraphicFramePr>
+              <a:graphicFrameLocks xmlns:a="http://schemas.openxmlformats.org/drawingml/2006/main" noChangeAspect="1"/>
+            </wp:cNvGraphicFramePr>
+            <a:graphic xmlns:a="http://schemas.openxmlformats.org/drawingml/2006/main">
+              <a:graphicData uri="http://schemas.openxmlformats.org/drawingml/2006/picture">
+                <pic:pic xmlns:pic="http://schemas.openxmlformats.org/drawingml/2006/picture">
+                  <pic:nvPicPr>
+                    <pic:cNvPr id="1" name=""/>
+                    <pic:cNvPicPr/>
+                  </pic:nvPicPr>
+                  <pic:blipFill>
+                    <a:blip r:embed="rId50"/>
+                    <a:stretch>
+                      <a:fillRect/>
+                    </a:stretch>
+                  </pic:blipFill>
+                  <pic:spPr>
+                    <a:xfrm>
+                      <a:off x="0" y="0"/>
+                      <a:ext cx="1781412" cy="108262"/>
+                    </a:xfrm>
+                    <a:prstGeom prst="rect">
+                      <a:avLst/>
+                    </a:prstGeom>
+                  </pic:spPr>
+                </pic:pic>
+              </a:graphicData>
+            </a:graphic>
+          </wp:inline>
+        </w:drawing>
+      </w:r>
+    </w:p>
+    <w:p>
+      <w:pPr>
+        <w:pStyle w:val="ListParagraph"/>
+        <w:rPr>
+          <w:b/>
+          <w:bCs/>
+        </w:rPr>
+      </w:pPr>
+      <w:r>
+        <w:rPr>
+          <w:noProof/>
+        </w:rPr>
+        <w:drawing>
+          <wp:inline distT="0" distB="0" distL="0" distR="0" wp14:anchorId="312FB1CA" wp14:editId="6B44915E">
+            <wp:extent cx="1476375" cy="81455"/>
+            <wp:effectExtent l="0" t="0" r="0" b="0"/>
+            <wp:docPr id="47" name="Picture 47"/>
+            <wp:cNvGraphicFramePr>
+              <a:graphicFrameLocks xmlns:a="http://schemas.openxmlformats.org/drawingml/2006/main" noChangeAspect="1"/>
+            </wp:cNvGraphicFramePr>
+            <a:graphic xmlns:a="http://schemas.openxmlformats.org/drawingml/2006/main">
+              <a:graphicData uri="http://schemas.openxmlformats.org/drawingml/2006/picture">
+                <pic:pic xmlns:pic="http://schemas.openxmlformats.org/drawingml/2006/picture">
+                  <pic:nvPicPr>
+                    <pic:cNvPr id="1" name=""/>
+                    <pic:cNvPicPr/>
+                  </pic:nvPicPr>
+                  <pic:blipFill>
+                    <a:blip r:embed="rId51"/>
+                    <a:stretch>
+                      <a:fillRect/>
+                    </a:stretch>
+                  </pic:blipFill>
+                  <pic:spPr>
+                    <a:xfrm>
+                      <a:off x="0" y="0"/>
+                      <a:ext cx="2735145" cy="150904"/>
+                    </a:xfrm>
+                    <a:prstGeom prst="rect">
+                      <a:avLst/>
+                    </a:prstGeom>
+                  </pic:spPr>
+                </pic:pic>
+              </a:graphicData>
+            </a:graphic>
+          </wp:inline>
+        </w:drawing>
+      </w:r>
+    </w:p>
+    <w:p>
+      <w:pPr>
+        <w:pStyle w:val="ListParagraph"/>
+        <w:numPr>
+          <w:ilvl w:val="0"/>
+          <w:numId w:val="1"/>
+        </w:numPr>
+        <w:rPr>
+          <w:b/>
+          <w:bCs/>
+        </w:rPr>
+      </w:pPr>
+      <w:r>
+        <w:rPr>
+          <w:b/>
+          <w:bCs/>
+        </w:rPr>
+        <w:t xml:space="preserve">Add more details in car admin page, </w:t>
+      </w:r>
+      <w:r>
+        <w:rPr>
+          <w:b/>
+          <w:bCs/>
+        </w:rPr>
+        <w:t>in</w:t>
+      </w:r>
+      <w:r>
+        <w:rPr>
+          <w:b/>
+          <w:bCs/>
+        </w:rPr>
+        <w:t xml:space="preserve"> admin.py </w:t>
+      </w:r>
+      <w:r>
+        <w:rPr>
+          <w:b/>
+          <w:bCs/>
+        </w:rPr>
+        <w:t>we</w:t>
+      </w:r>
+      <w:r>
+        <w:rPr>
+          <w:b/>
+          <w:bCs/>
+        </w:rPr>
+        <w:t xml:space="preserve"> add all information needed</w:t>
+      </w:r>
+    </w:p>
+    <w:p>
+      <w:pPr>
+        <w:pStyle w:val="ListParagraph"/>
+        <w:rPr>
+          <w:b/>
+          <w:bCs/>
+        </w:rPr>
+      </w:pPr>
+      <w:r>
+        <w:rPr>
+          <w:noProof/>
+        </w:rPr>
+        <w:drawing>
+          <wp:inline distT="0" distB="0" distL="0" distR="0" wp14:anchorId="706C23D4" wp14:editId="42FE2A89">
+            <wp:extent cx="2628900" cy="948716"/>
+            <wp:effectExtent l="0" t="0" r="0" b="3810"/>
+            <wp:docPr id="48" name="Picture 48"/>
+            <wp:cNvGraphicFramePr>
+              <a:graphicFrameLocks xmlns:a="http://schemas.openxmlformats.org/drawingml/2006/main" noChangeAspect="1"/>
+            </wp:cNvGraphicFramePr>
+            <a:graphic xmlns:a="http://schemas.openxmlformats.org/drawingml/2006/main">
+              <a:graphicData uri="http://schemas.openxmlformats.org/drawingml/2006/picture">
+                <pic:pic xmlns:pic="http://schemas.openxmlformats.org/drawingml/2006/picture">
+                  <pic:nvPicPr>
+                    <pic:cNvPr id="1" name=""/>
+                    <pic:cNvPicPr/>
+                  </pic:nvPicPr>
+                  <pic:blipFill>
+                    <a:blip r:embed="rId52"/>
+                    <a:stretch>
+                      <a:fillRect/>
+                    </a:stretch>
+                  </pic:blipFill>
+                  <pic:spPr>
+                    <a:xfrm>
+                      <a:off x="0" y="0"/>
+                      <a:ext cx="2645521" cy="954714"/>
+                    </a:xfrm>
+                    <a:prstGeom prst="rect">
+                      <a:avLst/>
+                    </a:prstGeom>
+                  </pic:spPr>
+                </pic:pic>
+              </a:graphicData>
+            </a:graphic>
+          </wp:inline>
+        </w:drawing>
+      </w:r>
+    </w:p>
+    <w:p>
+      <w:pPr>
+        <w:pStyle w:val="ListParagraph"/>
+        <w:numPr>
+          <w:ilvl w:val="0"/>
+          <w:numId w:val="1"/>
+        </w:numPr>
+        <w:rPr>
+          <w:b/>
+          <w:bCs/>
+        </w:rPr>
+      </w:pPr>
+      <w:r>
+        <w:rPr>
+          <w:b/>
+          <w:bCs/>
+        </w:rPr>
+        <w:t xml:space="preserve">Make one feature editable from admin dashboard direct </w:t>
+      </w:r>
+    </w:p>
+    <w:p>
+      <w:pPr>
+        <w:pStyle w:val="ListParagraph"/>
+        <w:rPr>
+          <w:b/>
+          <w:bCs/>
+        </w:rPr>
+      </w:pPr>
+      <w:r>
+        <w:rPr>
+          <w:noProof/>
+        </w:rPr>
+        <w:drawing>
+          <wp:inline distT="0" distB="0" distL="0" distR="0" wp14:anchorId="4F0B0EE2" wp14:editId="13661E99">
+            <wp:extent cx="361950" cy="805631"/>
+            <wp:effectExtent l="0" t="0" r="0" b="0"/>
+            <wp:docPr id="49" name="Picture 49"/>
+            <wp:cNvGraphicFramePr>
+              <a:graphicFrameLocks xmlns:a="http://schemas.openxmlformats.org/drawingml/2006/main" noChangeAspect="1"/>
+            </wp:cNvGraphicFramePr>
+            <a:graphic xmlns:a="http://schemas.openxmlformats.org/drawingml/2006/main">
+              <a:graphicData uri="http://schemas.openxmlformats.org/drawingml/2006/picture">
+                <pic:pic xmlns:pic="http://schemas.openxmlformats.org/drawingml/2006/picture">
+                  <pic:nvPicPr>
+                    <pic:cNvPr id="1" name=""/>
+                    <pic:cNvPicPr/>
+                  </pic:nvPicPr>
+                  <pic:blipFill>
+                    <a:blip r:embed="rId53"/>
+                    <a:stretch>
+                      <a:fillRect/>
+                    </a:stretch>
+                  </pic:blipFill>
+                  <pic:spPr>
+                    <a:xfrm>
+                      <a:off x="0" y="0"/>
+                      <a:ext cx="367539" cy="818072"/>
+                    </a:xfrm>
+                    <a:prstGeom prst="rect">
+                      <a:avLst/>
+                    </a:prstGeom>
+                  </pic:spPr>
+                </pic:pic>
+              </a:graphicData>
+            </a:graphic>
+          </wp:inline>
+        </w:drawing>
+      </w:r>
+    </w:p>
+    <w:p>
+      <w:pPr>
+        <w:pStyle w:val="ListParagraph"/>
+        <w:numPr>
+          <w:ilvl w:val="0"/>
+          <w:numId w:val="1"/>
+        </w:numPr>
+        <w:rPr>
+          <w:b/>
+          <w:bCs/>
+        </w:rPr>
+      </w:pPr>
+      <w:r>
+        <w:rPr>
+          <w:b/>
+          <w:bCs/>
+        </w:rPr>
+        <w:lastRenderedPageBreak/>
+        <w:t xml:space="preserve">view the cars images on the pages, go to view.py in pages (import cars model) then add the featrued_cars be orders by created date </w:t>
+      </w:r>
+    </w:p>
+    <w:p>
+      <w:pPr>
+        <w:pStyle w:val="ListParagraph"/>
+        <w:rPr>
+          <w:b/>
+          <w:bCs/>
+        </w:rPr>
+      </w:pPr>
+      <w:r>
+        <w:rPr>
+          <w:noProof/>
+        </w:rPr>
+        <w:drawing>
+          <wp:inline distT="0" distB="0" distL="0" distR="0" wp14:anchorId="5F52CCF6" wp14:editId="47E68212">
+            <wp:extent cx="3179404" cy="1256306"/>
+            <wp:effectExtent l="0" t="0" r="2540" b="1270"/>
+            <wp:docPr id="43" name="Picture 43"/>
+            <wp:cNvGraphicFramePr>
+              <a:graphicFrameLocks xmlns:a="http://schemas.openxmlformats.org/drawingml/2006/main" noChangeAspect="1"/>
+            </wp:cNvGraphicFramePr>
+            <a:graphic xmlns:a="http://schemas.openxmlformats.org/drawingml/2006/main">
+              <a:graphicData uri="http://schemas.openxmlformats.org/drawingml/2006/picture">
+                <pic:pic xmlns:pic="http://schemas.openxmlformats.org/drawingml/2006/picture">
+                  <pic:nvPicPr>
+                    <pic:cNvPr id="1" name=""/>
+                    <pic:cNvPicPr/>
+                  </pic:nvPicPr>
+                  <pic:blipFill>
+                    <a:blip r:embed="rId54"/>
+                    <a:stretch>
+                      <a:fillRect/>
+                    </a:stretch>
+                  </pic:blipFill>
+                  <pic:spPr>
+                    <a:xfrm>
+                      <a:off x="0" y="0"/>
+                      <a:ext cx="3214847" cy="1270311"/>
+                    </a:xfrm>
+                    <a:prstGeom prst="rect">
+                      <a:avLst/>
+                    </a:prstGeom>
+                  </pic:spPr>
+                </pic:pic>
+              </a:graphicData>
+            </a:graphic>
+          </wp:inline>
+        </w:drawing>
+      </w:r>
+    </w:p>
+    <w:p>
+      <w:pPr>
+        <w:pStyle w:val="ListParagraph"/>
+        <w:numPr>
+          <w:ilvl w:val="0"/>
+          <w:numId w:val="1"/>
+        </w:numPr>
+        <w:rPr>
+          <w:b/>
+          <w:bCs/>
+        </w:rPr>
+      </w:pPr>
+      <w:r>
+        <w:rPr>
+          <w:b/>
+          <w:bCs/>
+        </w:rPr>
+        <w:t>now the view ready to setup the data in home.html</w:t>
+      </w:r>
+    </w:p>
+    <w:p>
+      <w:pPr>
+        <w:pStyle w:val="ListParagraph"/>
+        <w:numPr>
+          <w:ilvl w:val="0"/>
+          <w:numId w:val="1"/>
+        </w:numPr>
+        <w:rPr>
+          <w:b/>
+          <w:bCs/>
+        </w:rPr>
+      </w:pPr>
+      <w:r>
+        <w:rPr>
+          <w:b/>
+          <w:bCs/>
+        </w:rPr>
+        <w:t>clean the div in home.html t</w:t>
+      </w:r>
+      <w:r>
+        <w:rPr>
+          <w:b/>
+          <w:bCs/>
+        </w:rPr>
+        <w:t>o add the dynamic cars features by using for loop</w:t>
+      </w:r>
+    </w:p>
+    <w:p>
+      <w:pPr>
+        <w:pStyle w:val="ListParagraph"/>
+        <w:numPr>
+          <w:ilvl w:val="0"/>
+          <w:numId w:val="1"/>
+        </w:numPr>
+        <w:rPr>
+          <w:b/>
+          <w:bCs/>
+        </w:rPr>
+      </w:pPr>
+      <w:r>
+        <w:rPr>
+          <w:b/>
+          <w:bCs/>
+        </w:rPr>
+        <w:t xml:space="preserve">add the </w:t>
+      </w:r>
+      <w:r>
+        <w:rPr>
+          <w:b/>
+          <w:bCs/>
+        </w:rPr>
+        <w:t>features</w:t>
+      </w:r>
+      <w:r>
+        <w:rPr>
+          <w:b/>
+          <w:bCs/>
+        </w:rPr>
+        <w:t xml:space="preserve"> such price photo and title</w:t>
+      </w:r>
+      <w:r>
+        <w:rPr>
+          <w:b/>
+          <w:bCs/>
+        </w:rPr>
+        <w:t xml:space="preserve"> {{car.car_title}}</w:t>
+      </w:r>
+      <w:r>
+        <w:rPr>
+          <w:b/>
+          <w:bCs/>
+        </w:rPr>
+        <w:t xml:space="preserve"> for images you must add url  {{car.car_photo.url}}</w:t>
+      </w:r>
+    </w:p>
+    <w:p>
+      <w:pPr>
+        <w:pStyle w:val="ListParagraph"/>
+        <w:numPr>
+          <w:ilvl w:val="0"/>
+          <w:numId w:val="1"/>
+        </w:numPr>
+        <w:rPr>
+          <w:b/>
+          <w:bCs/>
+        </w:rPr>
+      </w:pPr>
+      <w:r>
+        <w:rPr>
+          <w:b/>
+          <w:bCs/>
+        </w:rPr>
+        <w:t xml:space="preserve">add if loop to check if image available or not </w:t>
+      </w:r>
+      <w:r>
+        <w:rPr>
+          <w:b/>
+          <w:bCs/>
+          <w:color w:val="FF0000"/>
+        </w:rPr>
+        <w:t>(written without url)</w:t>
+      </w:r>
+    </w:p>
+    <w:p>
+      <w:pPr>
+        <w:pStyle w:val="ListParagraph"/>
+        <w:rPr>
+          <w:b/>
+          <w:bCs/>
+        </w:rPr>
+      </w:pPr>
+      <w:r>
+        <w:rPr>
+          <w:noProof/>
+        </w:rPr>
+        <w:drawing>
+          <wp:inline distT="0" distB="0" distL="0" distR="0" wp14:anchorId="2CC339A9" wp14:editId="4EA271D7">
+            <wp:extent cx="2894275" cy="1385350"/>
+            <wp:effectExtent l="0" t="0" r="1905" b="5715"/>
+            <wp:docPr id="51" name="Picture 51"/>
+            <wp:cNvGraphicFramePr>
+              <a:graphicFrameLocks xmlns:a="http://schemas.openxmlformats.org/drawingml/2006/main" noChangeAspect="1"/>
+            </wp:cNvGraphicFramePr>
+            <a:graphic xmlns:a="http://schemas.openxmlformats.org/drawingml/2006/main">
+              <a:graphicData uri="http://schemas.openxmlformats.org/drawingml/2006/picture">
+                <pic:pic xmlns:pic="http://schemas.openxmlformats.org/drawingml/2006/picture">
+                  <pic:nvPicPr>
+                    <pic:cNvPr id="1" name=""/>
+                    <pic:cNvPicPr/>
+                  </pic:nvPicPr>
+                  <pic:blipFill>
+                    <a:blip r:embed="rId55"/>
+                    <a:stretch>
+                      <a:fillRect/>
+                    </a:stretch>
+                  </pic:blipFill>
+                  <pic:spPr>
+                    <a:xfrm>
+                      <a:off x="0" y="0"/>
+                      <a:ext cx="2927255" cy="1401136"/>
+                    </a:xfrm>
+                    <a:prstGeom prst="rect">
+                      <a:avLst/>
+                    </a:prstGeom>
+                  </pic:spPr>
+                </pic:pic>
+              </a:graphicData>
+            </a:graphic>
+          </wp:inline>
+        </w:drawing>
+      </w:r>
+    </w:p>
+    <w:p>
+      <w:pPr>
+        <w:pStyle w:val="ListParagraph"/>
+        <w:numPr>
+          <w:ilvl w:val="0"/>
+          <w:numId w:val="1"/>
+        </w:numPr>
+        <w:rPr>
+          <w:b/>
+          <w:bCs/>
+        </w:rPr>
+      </w:pPr>
+      <w:r>
+        <w:rPr>
+          <w:b/>
+          <w:bCs/>
+        </w:rPr>
+        <w:t>for photo you have to manage the size</w:t>
+      </w:r>
+    </w:p>
+    <w:p>
+      <w:pPr>
+        <w:pStyle w:val="ListParagraph"/>
+        <w:numPr>
+          <w:ilvl w:val="0"/>
+          <w:numId w:val="1"/>
+        </w:numPr>
+        <w:rPr>
+          <w:b/>
+          <w:bCs/>
+        </w:rPr>
+      </w:pPr>
+      <w:r>
+        <w:rPr>
+          <w:b/>
+          <w:bCs/>
+        </w:rPr>
+        <w:t>again add all_cars in view.py and make for loop in home.html</w:t>
+      </w:r>
+    </w:p>
+    <w:p>
+      <w:pPr>
+        <w:pStyle w:val="ListParagraph"/>
+        <w:numPr>
+          <w:ilvl w:val="0"/>
+          <w:numId w:val="1"/>
+        </w:numPr>
+        <w:rPr>
+          <w:b/>
+          <w:bCs/>
+        </w:rPr>
+      </w:pPr>
+      <w:r>
+        <w:rPr>
+          <w:b/>
+          <w:bCs/>
+        </w:rPr>
+        <w:t>fixing numbers by add (,) to be more readable, so add Django.contrib.humanize apps in setting.py</w:t>
+      </w:r>
+      <w:r>
+        <w:rPr>
+          <w:b/>
+          <w:bCs/>
+        </w:rPr>
+        <w:t xml:space="preserve"> and add {% load humanize %} in home.html after {% block content %}</w:t>
+      </w:r>
+    </w:p>
+    <w:p>
+      <w:pPr>
+        <w:pStyle w:val="ListParagraph"/>
+        <w:rPr>
+          <w:b/>
+          <w:bCs/>
+        </w:rPr>
+      </w:pPr>
+      <w:r>
+        <w:rPr>
+          <w:noProof/>
+        </w:rPr>
+        <w:drawing>
+          <wp:inline distT="0" distB="0" distL="0" distR="0" wp14:anchorId="091E4872" wp14:editId="29930893">
+            <wp:extent cx="2200937" cy="1886517"/>
+            <wp:effectExtent l="0" t="0" r="8890" b="0"/>
+            <wp:docPr id="52" name="Picture 52"/>
+            <wp:cNvGraphicFramePr>
+              <a:graphicFrameLocks xmlns:a="http://schemas.openxmlformats.org/drawingml/2006/main" noChangeAspect="1"/>
+            </wp:cNvGraphicFramePr>
+            <a:graphic xmlns:a="http://schemas.openxmlformats.org/drawingml/2006/main">
+              <a:graphicData uri="http://schemas.openxmlformats.org/drawingml/2006/picture">
+                <pic:pic xmlns:pic="http://schemas.openxmlformats.org/drawingml/2006/picture">
+                  <pic:nvPicPr>
+                    <pic:cNvPr id="1" name=""/>
+                    <pic:cNvPicPr/>
+                  </pic:nvPicPr>
+                  <pic:blipFill>
+                    <a:blip r:embed="rId56"/>
+                    <a:stretch>
+                      <a:fillRect/>
+                    </a:stretch>
+                  </pic:blipFill>
+                  <pic:spPr>
+                    <a:xfrm>
+                      <a:off x="0" y="0"/>
+                      <a:ext cx="2236968" cy="1917400"/>
+                    </a:xfrm>
+                    <a:prstGeom prst="rect">
+                      <a:avLst/>
+                    </a:prstGeom>
+                  </pic:spPr>
+                </pic:pic>
+              </a:graphicData>
+            </a:graphic>
+          </wp:inline>
+        </w:drawing>
+      </w:r>
+    </w:p>
+    <w:p>
+      <w:pPr>
+        <w:pStyle w:val="ListParagraph"/>
+        <w:numPr>
+          <w:ilvl w:val="0"/>
+          <w:numId w:val="1"/>
+        </w:numPr>
+        <w:rPr>
+          <w:b/>
+          <w:bCs/>
+        </w:rPr>
+      </w:pPr>
+      <w:r>
+        <w:rPr>
+          <w:b/>
+          <w:bCs/>
+        </w:rPr>
+        <w:t xml:space="preserve">type {{car.price </w:t>
+      </w:r>
+      <w:r>
+        <w:rPr>
+          <w:b/>
+          <w:bCs/>
+          <w:color w:val="FF0000"/>
+        </w:rPr>
+        <w:t xml:space="preserve">| </w:t>
+      </w:r>
+      <w:bookmarkStart w:id="0" w:name="_GoBack"/>
+      <w:r>
+        <w:rPr>
+          <w:b/>
+          <w:bCs/>
+          <w:color w:val="FF0000"/>
+        </w:rPr>
+        <w:t>in</w:t>
+      </w:r>
+      <w:r>
+        <w:rPr>
+          <w:b/>
+          <w:bCs/>
+          <w:color w:val="FF0000"/>
+        </w:rPr>
+        <w:t>t</w:t>
+      </w:r>
+      <w:r>
+        <w:rPr>
+          <w:b/>
+          <w:bCs/>
+          <w:color w:val="FF0000"/>
+        </w:rPr>
+        <w:t>comma</w:t>
+      </w:r>
+      <w:bookmarkEnd w:id="0"/>
+      <w:r>
+        <w:rPr>
+          <w:b/>
+          <w:bCs/>
+        </w:rPr>
+        <w:t>}} after each numbers you need to add comma on it</w:t>
+      </w:r>
+    </w:p>
+    <w:p>
+      <w:pPr>
+        <w:pStyle w:val="ListParagraph"/>
+        <w:rPr>
+          <w:b/>
+          <w:bCs/>
+        </w:rPr>
+      </w:pPr>
+    </w:p>
+    <w:p>
+      <w:pPr>
+        <w:pStyle w:val="ListParagraph"/>
+        <w:rPr>
+          <w:b/>
+          <w:bCs/>
+        </w:rPr>
+      </w:pPr>
     </w:p>
     <w:sectPr>
       <w:pgSz w:w="12240" w:h="15840"/>

</xml_diff>